<commit_message>
new qa files added to the project
</commit_message>
<xml_diff>
--- a/knowledge_base/new-KB/DA-Help.docx
+++ b/knowledge_base/new-KB/DA-Help.docx
@@ -1,6 +1,6 @@
 
 <file path=word/document.xml><?xml version="1.0" encoding="utf-8"?>
-<w:document xmlns:wpc="http://schemas.microsoft.com/office/word/2010/wordprocessingCanvas" xmlns:cx="http://schemas.microsoft.com/office/drawing/2014/chartex" xmlns:cx1="http://schemas.microsoft.com/office/drawing/2015/9/8/chartex" xmlns:cx2="http://schemas.microsoft.com/office/drawing/2015/10/21/chartex" xmlns:cx3="http://schemas.microsoft.com/office/drawing/2016/5/9/chartex" xmlns:cx4="http://schemas.microsoft.com/office/drawing/2016/5/10/chartex" xmlns:cx5="http://schemas.microsoft.com/office/drawing/2016/5/11/chartex" xmlns:cx6="http://schemas.microsoft.com/office/drawing/2016/5/12/chartex" xmlns:cx7="http://schemas.microsoft.com/office/drawing/2016/5/13/chartex" xmlns:cx8="http://schemas.microsoft.com/office/drawing/2016/5/14/chartex" xmlns:mc="http://schemas.openxmlformats.org/markup-compatibility/2006" xmlns:aink="http://schemas.microsoft.com/office/drawing/2016/ink" xmlns:am3d="http://schemas.microsoft.com/office/drawing/2017/model3d" xmlns:o="urn:schemas-microsoft-com:office:office" xmlns:r="http://schemas.openxmlformats.org/officeDocument/2006/relationships" xmlns:m="http://schemas.openxmlformats.org/officeDocument/2006/math" xmlns:v="urn:schemas-microsoft-com:vml" xmlns:wp14="http://schemas.microsoft.com/office/word/2010/wordprocessingDrawing" xmlns:wp="http://schemas.openxmlformats.org/drawingml/2006/wordprocessingDrawing" xmlns:w10="urn:schemas-microsoft-com:office:word" xmlns:w="http://schemas.openxmlformats.org/wordprocessingml/2006/main" xmlns:w14="http://schemas.microsoft.com/office/word/2010/wordml" xmlns:w15="http://schemas.microsoft.com/office/word/2012/wordml" xmlns:w16cid="http://schemas.microsoft.com/office/word/2016/wordml/cid" xmlns:w16se="http://schemas.microsoft.com/office/word/2015/wordml/symex" xmlns:wpg="http://schemas.microsoft.com/office/word/2010/wordprocessingGroup" xmlns:wpi="http://schemas.microsoft.com/office/word/2010/wordprocessingInk" xmlns:wne="http://schemas.microsoft.com/office/word/2006/wordml" xmlns:wps="http://schemas.microsoft.com/office/word/2010/wordprocessingShape" mc:Ignorable="w14 w15 w16se w16cid wp14">
+<w:document xmlns:wpc="http://schemas.microsoft.com/office/word/2010/wordprocessingCanvas" xmlns:cx="http://schemas.microsoft.com/office/drawing/2014/chartex" xmlns:cx1="http://schemas.microsoft.com/office/drawing/2015/9/8/chartex" xmlns:cx2="http://schemas.microsoft.com/office/drawing/2015/10/21/chartex" xmlns:cx3="http://schemas.microsoft.com/office/drawing/2016/5/9/chartex" xmlns:cx4="http://schemas.microsoft.com/office/drawing/2016/5/10/chartex" xmlns:cx5="http://schemas.microsoft.com/office/drawing/2016/5/11/chartex" xmlns:cx6="http://schemas.microsoft.com/office/drawing/2016/5/12/chartex" xmlns:cx7="http://schemas.microsoft.com/office/drawing/2016/5/13/chartex" xmlns:cx8="http://schemas.microsoft.com/office/drawing/2016/5/14/chartex" xmlns:mc="http://schemas.openxmlformats.org/markup-compatibility/2006" xmlns:aink="http://schemas.microsoft.com/office/drawing/2016/ink" xmlns:am3d="http://schemas.microsoft.com/office/drawing/2017/model3d" xmlns:o="urn:schemas-microsoft-com:office:office" xmlns:r="http://schemas.openxmlformats.org/officeDocument/2006/relationships" xmlns:m="http://schemas.openxmlformats.org/officeDocument/2006/math" xmlns:v="urn:schemas-microsoft-com:vml" xmlns:wp14="http://schemas.microsoft.com/office/word/2010/wordprocessingDrawing" xmlns:wp="http://schemas.openxmlformats.org/drawingml/2006/wordprocessingDrawing" xmlns:w10="urn:schemas-microsoft-com:office:word" xmlns:w="http://schemas.openxmlformats.org/wordprocessingml/2006/main" xmlns:w14="http://schemas.microsoft.com/office/word/2010/wordml" xmlns:w15="http://schemas.microsoft.com/office/word/2012/wordml" xmlns:w16cex="http://schemas.microsoft.com/office/word/2018/wordml/cex" xmlns:w16cid="http://schemas.microsoft.com/office/word/2016/wordml/cid" xmlns:w16="http://schemas.microsoft.com/office/word/2018/wordml" xmlns:w16sdtdh="http://schemas.microsoft.com/office/word/2020/wordml/sdtdatahash" xmlns:w16se="http://schemas.microsoft.com/office/word/2015/wordml/symex" xmlns:wpg="http://schemas.microsoft.com/office/word/2010/wordprocessingGroup" xmlns:wpi="http://schemas.microsoft.com/office/word/2010/wordprocessingInk" xmlns:wne="http://schemas.microsoft.com/office/word/2006/wordml" xmlns:wps="http://schemas.microsoft.com/office/word/2010/wordprocessingShape" mc:Ignorable="w14 w15 w16se w16cid w16 w16cex w16sdtdh wp14">
   <w:body>
     <w:p>
       <w:pPr>
@@ -173,7 +173,130 @@
           <w:rtl/>
           <w:lang w:bidi="fa-IR"/>
         </w:rPr>
-        <w:t xml:space="preserve"> کاربران را در خصوص دو ماژول دفتر کل و انبار </w:t>
+        <w:t xml:space="preserve"> کاربران را در خصوص </w:t>
+      </w:r>
+      <w:proofErr w:type="spellStart"/>
+      <w:r>
+        <w:rPr>
+          <w:rFonts w:ascii="SG Kara" w:hAnsi="SG Kara" w:cs="SG Kara" w:hint="cs"/>
+          <w:sz w:val="20"/>
+          <w:szCs w:val="20"/>
+          <w:rtl/>
+          <w:lang w:bidi="fa-IR"/>
+        </w:rPr>
+        <w:t>ماژول</w:t>
+      </w:r>
+      <w:proofErr w:type="spellEnd"/>
+      <w:r>
+        <w:rPr>
+          <w:rFonts w:ascii="SG Kara" w:hAnsi="SG Kara" w:cs="SG Kara" w:hint="cs"/>
+          <w:sz w:val="20"/>
+          <w:szCs w:val="20"/>
+          <w:rtl/>
+          <w:lang w:bidi="fa-IR"/>
+        </w:rPr>
+        <w:t xml:space="preserve"> </w:t>
+      </w:r>
+      <w:r>
+        <w:rPr>
+          <w:rFonts w:ascii="SG Kara" w:hAnsi="SG Kara" w:cs="SG Kara" w:hint="cs"/>
+          <w:sz w:val="20"/>
+          <w:szCs w:val="20"/>
+          <w:rtl/>
+          <w:lang w:bidi="fa-IR"/>
+        </w:rPr>
+        <w:t xml:space="preserve">های </w:t>
+      </w:r>
+      <w:r>
+        <w:rPr>
+          <w:rFonts w:ascii="SG Kara" w:hAnsi="SG Kara" w:cs="SG Kara" w:hint="cs"/>
+          <w:sz w:val="20"/>
+          <w:szCs w:val="20"/>
+          <w:rtl/>
+          <w:lang w:bidi="fa-IR"/>
+        </w:rPr>
+        <w:t>دفتر کل</w:t>
+      </w:r>
+      <w:r>
+        <w:rPr>
+          <w:rFonts w:ascii="SG Kara" w:hAnsi="SG Kara" w:cs="SG Kara" w:hint="cs"/>
+          <w:sz w:val="20"/>
+          <w:szCs w:val="20"/>
+          <w:rtl/>
+          <w:lang w:bidi="fa-IR"/>
+        </w:rPr>
+        <w:t xml:space="preserve">، </w:t>
+      </w:r>
+      <w:r>
+        <w:rPr>
+          <w:rFonts w:ascii="SG Kara" w:hAnsi="SG Kara" w:cs="SG Kara" w:hint="cs"/>
+          <w:sz w:val="20"/>
+          <w:szCs w:val="20"/>
+          <w:rtl/>
+          <w:lang w:bidi="fa-IR"/>
+        </w:rPr>
+        <w:t>انبار</w:t>
+      </w:r>
+      <w:r>
+        <w:rPr>
+          <w:rFonts w:ascii="SG Kara" w:hAnsi="SG Kara" w:cs="SG Kara" w:hint="cs"/>
+          <w:sz w:val="20"/>
+          <w:szCs w:val="20"/>
+          <w:rtl/>
+          <w:lang w:bidi="fa-IR"/>
+        </w:rPr>
+        <w:t xml:space="preserve">، گزارش ساز، فروش، ارتباط با سامانه </w:t>
+      </w:r>
+      <w:proofErr w:type="spellStart"/>
+      <w:r>
+        <w:rPr>
+          <w:rFonts w:ascii="SG Kara" w:hAnsi="SG Kara" w:cs="SG Kara" w:hint="cs"/>
+          <w:sz w:val="20"/>
+          <w:szCs w:val="20"/>
+          <w:rtl/>
+          <w:lang w:bidi="fa-IR"/>
+        </w:rPr>
+        <w:t>مودیان</w:t>
+      </w:r>
+      <w:proofErr w:type="spellEnd"/>
+      <w:r>
+        <w:rPr>
+          <w:rFonts w:ascii="SG Kara" w:hAnsi="SG Kara" w:cs="SG Kara" w:hint="cs"/>
+          <w:sz w:val="20"/>
+          <w:szCs w:val="20"/>
+          <w:rtl/>
+          <w:lang w:bidi="fa-IR"/>
+        </w:rPr>
+        <w:t xml:space="preserve"> مالیاتی، خزانه داری و مدیریت ارتباط با مشتریان (</w:t>
+      </w:r>
+      <w:r>
+        <w:rPr>
+          <w:rFonts w:ascii="SG Kara" w:hAnsi="SG Kara" w:cs="SG Kara"/>
+          <w:sz w:val="20"/>
+          <w:szCs w:val="20"/>
+          <w:lang w:bidi="fa-IR"/>
+        </w:rPr>
+        <w:t>CRM</w:t>
+      </w:r>
+      <w:r>
+        <w:rPr>
+          <w:rFonts w:ascii="SG Kara" w:hAnsi="SG Kara" w:cs="SG Kara" w:hint="cs"/>
+          <w:sz w:val="20"/>
+          <w:szCs w:val="20"/>
+          <w:rtl/>
+          <w:lang w:bidi="fa-IR"/>
+        </w:rPr>
+        <w:t xml:space="preserve">) </w:t>
+      </w:r>
+      <w:r>
+        <w:rPr>
+          <w:rFonts w:ascii="SG Kara" w:hAnsi="SG Kara" w:cs="SG Kara" w:hint="cs"/>
+          <w:sz w:val="20"/>
+          <w:szCs w:val="20"/>
+          <w:rtl/>
+          <w:lang w:bidi="fa-IR"/>
+        </w:rPr>
+        <w:t xml:space="preserve"> </w:t>
       </w:r>
       <w:r>
         <w:rPr>
@@ -464,65 +587,6 @@
           <w:lang w:bidi="fa-IR"/>
         </w:rPr>
       </w:pPr>
-      <w:r>
-        <w:rPr>
-          <w:rFonts w:ascii="SG Kara" w:hAnsi="SG Kara" w:cs="SG Kara"/>
-          <w:b/>
-          <w:bCs/>
-          <w:noProof/>
-          <w:sz w:val="20"/>
-          <w:szCs w:val="20"/>
-          <w:lang w:bidi="fa-IR"/>
-        </w:rPr>
-        <w:drawing>
-          <wp:inline distT="0" distB="0" distL="0" distR="0" wp14:anchorId="4A2B337A" wp14:editId="33CF0336">
-            <wp:extent cx="5935345" cy="3898822"/>
-            <wp:effectExtent l="0" t="0" r="8255" b="6985"/>
-            <wp:docPr id="1" name="Picture 1"/>
-            <wp:cNvGraphicFramePr>
-              <a:graphicFrameLocks xmlns:a="http://schemas.openxmlformats.org/drawingml/2006/main" noChangeAspect="1"/>
-            </wp:cNvGraphicFramePr>
-            <a:graphic xmlns:a="http://schemas.openxmlformats.org/drawingml/2006/main">
-              <a:graphicData uri="http://schemas.openxmlformats.org/drawingml/2006/picture">
-                <pic:pic xmlns:pic="http://schemas.openxmlformats.org/drawingml/2006/picture">
-                  <pic:nvPicPr>
-                    <pic:cNvPr id="0" name="Picture 1"/>
-                    <pic:cNvPicPr>
-                      <a:picLocks noChangeAspect="1" noChangeArrowheads="1"/>
-                    </pic:cNvPicPr>
-                  </pic:nvPicPr>
-                  <pic:blipFill>
-                    <a:blip r:embed="rId7">
-                      <a:extLst>
-                        <a:ext uri="{28A0092B-C50C-407E-A947-70E740481C1C}">
-                          <a14:useLocalDpi xmlns:a14="http://schemas.microsoft.com/office/drawing/2010/main" val="0"/>
-                        </a:ext>
-                      </a:extLst>
-                    </a:blip>
-                    <a:srcRect/>
-                    <a:stretch>
-                      <a:fillRect/>
-                    </a:stretch>
-                  </pic:blipFill>
-                  <pic:spPr bwMode="auto">
-                    <a:xfrm>
-                      <a:off x="0" y="0"/>
-                      <a:ext cx="5949823" cy="3908332"/>
-                    </a:xfrm>
-                    <a:prstGeom prst="rect">
-                      <a:avLst/>
-                    </a:prstGeom>
-                    <a:noFill/>
-                    <a:ln>
-                      <a:noFill/>
-                    </a:ln>
-                  </pic:spPr>
-                </pic:pic>
-              </a:graphicData>
-            </a:graphic>
-          </wp:inline>
-        </w:drawing>
-      </w:r>
     </w:p>
     <w:p>
       <w:pPr>
@@ -580,26 +644,47 @@
           <w:rtl/>
           <w:lang w:bidi="fa-IR"/>
         </w:rPr>
-        <w:t xml:space="preserve">در همه جای سیستم در قسمت پایین سمت راست، دکمه ای با علامت آبی رنگ به شکل </w:t>
-      </w:r>
-      <w:r>
-        <w:rPr>
-          <w:rFonts w:ascii="SG Kara" w:hAnsi="SG Kara" w:cs="SG Kara"/>
-          <w:sz w:val="20"/>
-          <w:szCs w:val="20"/>
-          <w:lang w:bidi="fa-IR"/>
-        </w:rPr>
-        <w:t>Q</w:t>
-      </w:r>
-      <w:r>
-        <w:rPr>
-          <w:rFonts w:ascii="SG Kara" w:hAnsi="SG Kara" w:cs="SG Kara" w:hint="cs"/>
-          <w:sz w:val="20"/>
-          <w:szCs w:val="20"/>
-          <w:rtl/>
-          <w:lang w:bidi="fa-IR"/>
-        </w:rPr>
-        <w:t xml:space="preserve"> بر روی آن دیده میشود. در صورت فشردن این دکمه، چت </w:t>
+        <w:t xml:space="preserve">در همه جای سیستم در قسمت </w:t>
+      </w:r>
+      <w:r>
+        <w:rPr>
+          <w:rFonts w:ascii="SG Kara" w:hAnsi="SG Kara" w:cs="SG Kara" w:hint="cs"/>
+          <w:sz w:val="20"/>
+          <w:szCs w:val="20"/>
+          <w:rtl/>
+          <w:lang w:bidi="fa-IR"/>
+        </w:rPr>
+        <w:t>بالا</w:t>
+      </w:r>
+      <w:r>
+        <w:rPr>
+          <w:rFonts w:ascii="SG Kara" w:hAnsi="SG Kara" w:cs="SG Kara" w:hint="cs"/>
+          <w:sz w:val="20"/>
+          <w:szCs w:val="20"/>
+          <w:rtl/>
+          <w:lang w:bidi="fa-IR"/>
+        </w:rPr>
+        <w:t xml:space="preserve"> سمت </w:t>
+      </w:r>
+      <w:r>
+        <w:rPr>
+          <w:rFonts w:ascii="SG Kara" w:hAnsi="SG Kara" w:cs="SG Kara" w:hint="cs"/>
+          <w:sz w:val="20"/>
+          <w:szCs w:val="20"/>
+          <w:rtl/>
+          <w:lang w:bidi="fa-IR"/>
+        </w:rPr>
+        <w:t>چپ</w:t>
+      </w:r>
+      <w:r>
+        <w:rPr>
+          <w:rFonts w:ascii="SG Kara" w:hAnsi="SG Kara" w:cs="SG Kara" w:hint="cs"/>
+          <w:sz w:val="20"/>
+          <w:szCs w:val="20"/>
+          <w:rtl/>
+          <w:lang w:bidi="fa-IR"/>
+        </w:rPr>
+        <w:t xml:space="preserve">، دکمه ای آبی رنگ دیده میشود. در صورت فشردن این دکمه، چت </w:t>
       </w:r>
       <w:proofErr w:type="spellStart"/>
       <w:r>
@@ -665,7 +750,7 @@
                     </pic:cNvPicPr>
                   </pic:nvPicPr>
                   <pic:blipFill>
-                    <a:blip r:embed="rId8">
+                    <a:blip r:embed="rId7">
                       <a:extLst>
                         <a:ext uri="{28A0092B-C50C-407E-A947-70E740481C1C}">
                           <a14:useLocalDpi xmlns:a14="http://schemas.microsoft.com/office/drawing/2010/main" val="0"/>
@@ -939,6 +1024,7 @@
       <w:r>
         <w:rPr>
           <w:rFonts w:ascii="SG Kara" w:hAnsi="SG Kara" w:cs="SG Kara"/>
+          <w:noProof/>
           <w:sz w:val="20"/>
           <w:szCs w:val="20"/>
           <w:rtl/>
@@ -960,7 +1046,7 @@
                     <pic:cNvPicPr/>
                   </pic:nvPicPr>
                   <pic:blipFill>
-                    <a:blip r:embed="rId9"/>
+                    <a:blip r:embed="rId8"/>
                     <a:stretch>
                       <a:fillRect/>
                     </a:stretch>
@@ -1273,8 +1359,6 @@
           <w:lang w:bidi="fa-IR"/>
         </w:rPr>
       </w:pPr>
-      <w:bookmarkStart w:id="0" w:name="_GoBack"/>
-      <w:bookmarkEnd w:id="0"/>
       <w:r>
         <w:rPr>
           <w:rFonts w:ascii="SG Kara" w:hAnsi="SG Kara" w:cs="SG Kara" w:hint="cs"/>
@@ -1337,7 +1421,7 @@
       </w:r>
     </w:p>
     <w:sectPr>
-      <w:footerReference w:type="default" r:id="rId10"/>
+      <w:footerReference w:type="default" r:id="rId9"/>
       <w:pgSz w:w="12240" w:h="15840"/>
       <w:pgMar w:top="1440" w:right="1440" w:bottom="1440" w:left="1440" w:header="720" w:footer="720" w:gutter="0"/>
       <w:cols w:space="720"/>
@@ -1348,7 +1432,7 @@
 </file>
 
 <file path=word/endnotes.xml><?xml version="1.0" encoding="utf-8"?>
-<w:endnotes xmlns:wpc="http://schemas.microsoft.com/office/word/2010/wordprocessingCanvas" xmlns:cx="http://schemas.microsoft.com/office/drawing/2014/chartex" xmlns:cx1="http://schemas.microsoft.com/office/drawing/2015/9/8/chartex" xmlns:cx2="http://schemas.microsoft.com/office/drawing/2015/10/21/chartex" xmlns:cx3="http://schemas.microsoft.com/office/drawing/2016/5/9/chartex" xmlns:cx4="http://schemas.microsoft.com/office/drawing/2016/5/10/chartex" xmlns:cx5="http://schemas.microsoft.com/office/drawing/2016/5/11/chartex" xmlns:cx6="http://schemas.microsoft.com/office/drawing/2016/5/12/chartex" xmlns:cx7="http://schemas.microsoft.com/office/drawing/2016/5/13/chartex" xmlns:cx8="http://schemas.microsoft.com/office/drawing/2016/5/14/chartex" xmlns:mc="http://schemas.openxmlformats.org/markup-compatibility/2006" xmlns:aink="http://schemas.microsoft.com/office/drawing/2016/ink" xmlns:am3d="http://schemas.microsoft.com/office/drawing/2017/model3d" xmlns:o="urn:schemas-microsoft-com:office:office" xmlns:r="http://schemas.openxmlformats.org/officeDocument/2006/relationships" xmlns:m="http://schemas.openxmlformats.org/officeDocument/2006/math" xmlns:v="urn:schemas-microsoft-com:vml" xmlns:wp14="http://schemas.microsoft.com/office/word/2010/wordprocessingDrawing" xmlns:wp="http://schemas.openxmlformats.org/drawingml/2006/wordprocessingDrawing" xmlns:w10="urn:schemas-microsoft-com:office:word" xmlns:w="http://schemas.openxmlformats.org/wordprocessingml/2006/main" xmlns:w14="http://schemas.microsoft.com/office/word/2010/wordml" xmlns:w15="http://schemas.microsoft.com/office/word/2012/wordml" xmlns:w16cid="http://schemas.microsoft.com/office/word/2016/wordml/cid" xmlns:w16se="http://schemas.microsoft.com/office/word/2015/wordml/symex" xmlns:wpg="http://schemas.microsoft.com/office/word/2010/wordprocessingGroup" xmlns:wpi="http://schemas.microsoft.com/office/word/2010/wordprocessingInk" xmlns:wne="http://schemas.microsoft.com/office/word/2006/wordml" xmlns:wps="http://schemas.microsoft.com/office/word/2010/wordprocessingShape" mc:Ignorable="w14 w15 w16se w16cid wp14">
+<w:endnotes xmlns:wpc="http://schemas.microsoft.com/office/word/2010/wordprocessingCanvas" xmlns:cx="http://schemas.microsoft.com/office/drawing/2014/chartex" xmlns:cx1="http://schemas.microsoft.com/office/drawing/2015/9/8/chartex" xmlns:cx2="http://schemas.microsoft.com/office/drawing/2015/10/21/chartex" xmlns:cx3="http://schemas.microsoft.com/office/drawing/2016/5/9/chartex" xmlns:cx4="http://schemas.microsoft.com/office/drawing/2016/5/10/chartex" xmlns:cx5="http://schemas.microsoft.com/office/drawing/2016/5/11/chartex" xmlns:cx6="http://schemas.microsoft.com/office/drawing/2016/5/12/chartex" xmlns:cx7="http://schemas.microsoft.com/office/drawing/2016/5/13/chartex" xmlns:cx8="http://schemas.microsoft.com/office/drawing/2016/5/14/chartex" xmlns:mc="http://schemas.openxmlformats.org/markup-compatibility/2006" xmlns:aink="http://schemas.microsoft.com/office/drawing/2016/ink" xmlns:am3d="http://schemas.microsoft.com/office/drawing/2017/model3d" xmlns:o="urn:schemas-microsoft-com:office:office" xmlns:r="http://schemas.openxmlformats.org/officeDocument/2006/relationships" xmlns:m="http://schemas.openxmlformats.org/officeDocument/2006/math" xmlns:v="urn:schemas-microsoft-com:vml" xmlns:wp14="http://schemas.microsoft.com/office/word/2010/wordprocessingDrawing" xmlns:wp="http://schemas.openxmlformats.org/drawingml/2006/wordprocessingDrawing" xmlns:w10="urn:schemas-microsoft-com:office:word" xmlns:w="http://schemas.openxmlformats.org/wordprocessingml/2006/main" xmlns:w14="http://schemas.microsoft.com/office/word/2010/wordml" xmlns:w15="http://schemas.microsoft.com/office/word/2012/wordml" xmlns:w16cex="http://schemas.microsoft.com/office/word/2018/wordml/cex" xmlns:w16cid="http://schemas.microsoft.com/office/word/2016/wordml/cid" xmlns:w16="http://schemas.microsoft.com/office/word/2018/wordml" xmlns:w16sdtdh="http://schemas.microsoft.com/office/word/2020/wordml/sdtdatahash" xmlns:w16se="http://schemas.microsoft.com/office/word/2015/wordml/symex" xmlns:wpg="http://schemas.microsoft.com/office/word/2010/wordprocessingGroup" xmlns:wpi="http://schemas.microsoft.com/office/word/2010/wordprocessingInk" xmlns:wne="http://schemas.microsoft.com/office/word/2006/wordml" xmlns:wps="http://schemas.microsoft.com/office/word/2010/wordprocessingShape" mc:Ignorable="w14 w15 w16se w16cid w16 w16cex w16sdtdh wp14">
   <w:endnote w:type="separator" w:id="-1">
     <w:p>
       <w:pPr>
@@ -1373,7 +1457,7 @@
 </file>
 
 <file path=word/footer1.xml><?xml version="1.0" encoding="utf-8"?>
-<w:ftr xmlns:wpc="http://schemas.microsoft.com/office/word/2010/wordprocessingCanvas" xmlns:cx="http://schemas.microsoft.com/office/drawing/2014/chartex" xmlns:cx1="http://schemas.microsoft.com/office/drawing/2015/9/8/chartex" xmlns:cx2="http://schemas.microsoft.com/office/drawing/2015/10/21/chartex" xmlns:cx3="http://schemas.microsoft.com/office/drawing/2016/5/9/chartex" xmlns:cx4="http://schemas.microsoft.com/office/drawing/2016/5/10/chartex" xmlns:cx5="http://schemas.microsoft.com/office/drawing/2016/5/11/chartex" xmlns:cx6="http://schemas.microsoft.com/office/drawing/2016/5/12/chartex" xmlns:cx7="http://schemas.microsoft.com/office/drawing/2016/5/13/chartex" xmlns:cx8="http://schemas.microsoft.com/office/drawing/2016/5/14/chartex" xmlns:mc="http://schemas.openxmlformats.org/markup-compatibility/2006" xmlns:aink="http://schemas.microsoft.com/office/drawing/2016/ink" xmlns:am3d="http://schemas.microsoft.com/office/drawing/2017/model3d" xmlns:o="urn:schemas-microsoft-com:office:office" xmlns:r="http://schemas.openxmlformats.org/officeDocument/2006/relationships" xmlns:m="http://schemas.openxmlformats.org/officeDocument/2006/math" xmlns:v="urn:schemas-microsoft-com:vml" xmlns:wp14="http://schemas.microsoft.com/office/word/2010/wordprocessingDrawing" xmlns:wp="http://schemas.openxmlformats.org/drawingml/2006/wordprocessingDrawing" xmlns:w10="urn:schemas-microsoft-com:office:word" xmlns:w="http://schemas.openxmlformats.org/wordprocessingml/2006/main" xmlns:w14="http://schemas.microsoft.com/office/word/2010/wordml" xmlns:w15="http://schemas.microsoft.com/office/word/2012/wordml" xmlns:w16cid="http://schemas.microsoft.com/office/word/2016/wordml/cid" xmlns:w16se="http://schemas.microsoft.com/office/word/2015/wordml/symex" xmlns:wpg="http://schemas.microsoft.com/office/word/2010/wordprocessingGroup" xmlns:wpi="http://schemas.microsoft.com/office/word/2010/wordprocessingInk" xmlns:wne="http://schemas.microsoft.com/office/word/2006/wordml" xmlns:wps="http://schemas.microsoft.com/office/word/2010/wordprocessingShape" mc:Ignorable="w14 w15 w16se w16cid wp14">
+<w:ftr xmlns:wpc="http://schemas.microsoft.com/office/word/2010/wordprocessingCanvas" xmlns:cx="http://schemas.microsoft.com/office/drawing/2014/chartex" xmlns:cx1="http://schemas.microsoft.com/office/drawing/2015/9/8/chartex" xmlns:cx2="http://schemas.microsoft.com/office/drawing/2015/10/21/chartex" xmlns:cx3="http://schemas.microsoft.com/office/drawing/2016/5/9/chartex" xmlns:cx4="http://schemas.microsoft.com/office/drawing/2016/5/10/chartex" xmlns:cx5="http://schemas.microsoft.com/office/drawing/2016/5/11/chartex" xmlns:cx6="http://schemas.microsoft.com/office/drawing/2016/5/12/chartex" xmlns:cx7="http://schemas.microsoft.com/office/drawing/2016/5/13/chartex" xmlns:cx8="http://schemas.microsoft.com/office/drawing/2016/5/14/chartex" xmlns:mc="http://schemas.openxmlformats.org/markup-compatibility/2006" xmlns:aink="http://schemas.microsoft.com/office/drawing/2016/ink" xmlns:am3d="http://schemas.microsoft.com/office/drawing/2017/model3d" xmlns:o="urn:schemas-microsoft-com:office:office" xmlns:r="http://schemas.openxmlformats.org/officeDocument/2006/relationships" xmlns:m="http://schemas.openxmlformats.org/officeDocument/2006/math" xmlns:v="urn:schemas-microsoft-com:vml" xmlns:wp14="http://schemas.microsoft.com/office/word/2010/wordprocessingDrawing" xmlns:wp="http://schemas.openxmlformats.org/drawingml/2006/wordprocessingDrawing" xmlns:w10="urn:schemas-microsoft-com:office:word" xmlns:w="http://schemas.openxmlformats.org/wordprocessingml/2006/main" xmlns:w14="http://schemas.microsoft.com/office/word/2010/wordml" xmlns:w15="http://schemas.microsoft.com/office/word/2012/wordml" xmlns:w16cex="http://schemas.microsoft.com/office/word/2018/wordml/cex" xmlns:w16cid="http://schemas.microsoft.com/office/word/2016/wordml/cid" xmlns:w16="http://schemas.microsoft.com/office/word/2018/wordml" xmlns:w16sdtdh="http://schemas.microsoft.com/office/word/2020/wordml/sdtdatahash" xmlns:w16se="http://schemas.microsoft.com/office/word/2015/wordml/symex" xmlns:wpg="http://schemas.microsoft.com/office/word/2010/wordprocessingGroup" xmlns:wpi="http://schemas.microsoft.com/office/word/2010/wordprocessingInk" xmlns:wne="http://schemas.microsoft.com/office/word/2006/wordml" xmlns:wps="http://schemas.microsoft.com/office/word/2010/wordprocessingShape" mc:Ignorable="w14 w15 w16se w16cid w16 w16cex w16sdtdh wp14">
   <w:sdt>
     <w:sdtPr>
       <w:id w:val="545717577"/>
@@ -1382,6 +1466,7 @@
         <w:docPartUnique/>
       </w:docPartObj>
     </w:sdtPr>
+    <w:sdtEndPr/>
     <w:sdtContent>
       <w:sdt>
         <w:sdtPr>
@@ -1391,6 +1476,7 @@
             <w:docPartUnique/>
           </w:docPartObj>
         </w:sdtPr>
+        <w:sdtEndPr/>
         <w:sdtContent>
           <w:p>
             <w:pPr>
@@ -1501,7 +1587,7 @@
 </file>
 
 <file path=word/footnotes.xml><?xml version="1.0" encoding="utf-8"?>
-<w:footnotes xmlns:wpc="http://schemas.microsoft.com/office/word/2010/wordprocessingCanvas" xmlns:cx="http://schemas.microsoft.com/office/drawing/2014/chartex" xmlns:cx1="http://schemas.microsoft.com/office/drawing/2015/9/8/chartex" xmlns:cx2="http://schemas.microsoft.com/office/drawing/2015/10/21/chartex" xmlns:cx3="http://schemas.microsoft.com/office/drawing/2016/5/9/chartex" xmlns:cx4="http://schemas.microsoft.com/office/drawing/2016/5/10/chartex" xmlns:cx5="http://schemas.microsoft.com/office/drawing/2016/5/11/chartex" xmlns:cx6="http://schemas.microsoft.com/office/drawing/2016/5/12/chartex" xmlns:cx7="http://schemas.microsoft.com/office/drawing/2016/5/13/chartex" xmlns:cx8="http://schemas.microsoft.com/office/drawing/2016/5/14/chartex" xmlns:mc="http://schemas.openxmlformats.org/markup-compatibility/2006" xmlns:aink="http://schemas.microsoft.com/office/drawing/2016/ink" xmlns:am3d="http://schemas.microsoft.com/office/drawing/2017/model3d" xmlns:o="urn:schemas-microsoft-com:office:office" xmlns:r="http://schemas.openxmlformats.org/officeDocument/2006/relationships" xmlns:m="http://schemas.openxmlformats.org/officeDocument/2006/math" xmlns:v="urn:schemas-microsoft-com:vml" xmlns:wp14="http://schemas.microsoft.com/office/word/2010/wordprocessingDrawing" xmlns:wp="http://schemas.openxmlformats.org/drawingml/2006/wordprocessingDrawing" xmlns:w10="urn:schemas-microsoft-com:office:word" xmlns:w="http://schemas.openxmlformats.org/wordprocessingml/2006/main" xmlns:w14="http://schemas.microsoft.com/office/word/2010/wordml" xmlns:w15="http://schemas.microsoft.com/office/word/2012/wordml" xmlns:w16cid="http://schemas.microsoft.com/office/word/2016/wordml/cid" xmlns:w16se="http://schemas.microsoft.com/office/word/2015/wordml/symex" xmlns:wpg="http://schemas.microsoft.com/office/word/2010/wordprocessingGroup" xmlns:wpi="http://schemas.microsoft.com/office/word/2010/wordprocessingInk" xmlns:wne="http://schemas.microsoft.com/office/word/2006/wordml" xmlns:wps="http://schemas.microsoft.com/office/word/2010/wordprocessingShape" mc:Ignorable="w14 w15 w16se w16cid wp14">
+<w:footnotes xmlns:wpc="http://schemas.microsoft.com/office/word/2010/wordprocessingCanvas" xmlns:cx="http://schemas.microsoft.com/office/drawing/2014/chartex" xmlns:cx1="http://schemas.microsoft.com/office/drawing/2015/9/8/chartex" xmlns:cx2="http://schemas.microsoft.com/office/drawing/2015/10/21/chartex" xmlns:cx3="http://schemas.microsoft.com/office/drawing/2016/5/9/chartex" xmlns:cx4="http://schemas.microsoft.com/office/drawing/2016/5/10/chartex" xmlns:cx5="http://schemas.microsoft.com/office/drawing/2016/5/11/chartex" xmlns:cx6="http://schemas.microsoft.com/office/drawing/2016/5/12/chartex" xmlns:cx7="http://schemas.microsoft.com/office/drawing/2016/5/13/chartex" xmlns:cx8="http://schemas.microsoft.com/office/drawing/2016/5/14/chartex" xmlns:mc="http://schemas.openxmlformats.org/markup-compatibility/2006" xmlns:aink="http://schemas.microsoft.com/office/drawing/2016/ink" xmlns:am3d="http://schemas.microsoft.com/office/drawing/2017/model3d" xmlns:o="urn:schemas-microsoft-com:office:office" xmlns:r="http://schemas.openxmlformats.org/officeDocument/2006/relationships" xmlns:m="http://schemas.openxmlformats.org/officeDocument/2006/math" xmlns:v="urn:schemas-microsoft-com:vml" xmlns:wp14="http://schemas.microsoft.com/office/word/2010/wordprocessingDrawing" xmlns:wp="http://schemas.openxmlformats.org/drawingml/2006/wordprocessingDrawing" xmlns:w10="urn:schemas-microsoft-com:office:word" xmlns:w="http://schemas.openxmlformats.org/wordprocessingml/2006/main" xmlns:w14="http://schemas.microsoft.com/office/word/2010/wordml" xmlns:w15="http://schemas.microsoft.com/office/word/2012/wordml" xmlns:w16cex="http://schemas.microsoft.com/office/word/2018/wordml/cex" xmlns:w16cid="http://schemas.microsoft.com/office/word/2016/wordml/cid" xmlns:w16="http://schemas.microsoft.com/office/word/2018/wordml" xmlns:w16sdtdh="http://schemas.microsoft.com/office/word/2020/wordml/sdtdatahash" xmlns:w16se="http://schemas.microsoft.com/office/word/2015/wordml/symex" xmlns:wpg="http://schemas.microsoft.com/office/word/2010/wordprocessingGroup" xmlns:wpi="http://schemas.microsoft.com/office/word/2010/wordprocessingInk" xmlns:wne="http://schemas.microsoft.com/office/word/2006/wordml" xmlns:wps="http://schemas.microsoft.com/office/word/2010/wordprocessingShape" mc:Ignorable="w14 w15 w16se w16cid w16 w16cex w16sdtdh wp14">
   <w:footnote w:type="separator" w:id="-1">
     <w:p>
       <w:pPr>
@@ -1526,7 +1612,7 @@
 </file>
 
 <file path=word/numbering.xml><?xml version="1.0" encoding="utf-8"?>
-<w:numbering xmlns:wpc="http://schemas.microsoft.com/office/word/2010/wordprocessingCanvas" xmlns:cx="http://schemas.microsoft.com/office/drawing/2014/chartex" xmlns:cx1="http://schemas.microsoft.com/office/drawing/2015/9/8/chartex" xmlns:cx2="http://schemas.microsoft.com/office/drawing/2015/10/21/chartex" xmlns:cx3="http://schemas.microsoft.com/office/drawing/2016/5/9/chartex" xmlns:cx4="http://schemas.microsoft.com/office/drawing/2016/5/10/chartex" xmlns:cx5="http://schemas.microsoft.com/office/drawing/2016/5/11/chartex" xmlns:cx6="http://schemas.microsoft.com/office/drawing/2016/5/12/chartex" xmlns:cx7="http://schemas.microsoft.com/office/drawing/2016/5/13/chartex" xmlns:cx8="http://schemas.microsoft.com/office/drawing/2016/5/14/chartex" xmlns:mc="http://schemas.openxmlformats.org/markup-compatibility/2006" xmlns:aink="http://schemas.microsoft.com/office/drawing/2016/ink" xmlns:am3d="http://schemas.microsoft.com/office/drawing/2017/model3d" xmlns:o="urn:schemas-microsoft-com:office:office" xmlns:r="http://schemas.openxmlformats.org/officeDocument/2006/relationships" xmlns:m="http://schemas.openxmlformats.org/officeDocument/2006/math" xmlns:v="urn:schemas-microsoft-com:vml" xmlns:wp14="http://schemas.microsoft.com/office/word/2010/wordprocessingDrawing" xmlns:wp="http://schemas.openxmlformats.org/drawingml/2006/wordprocessingDrawing" xmlns:w10="urn:schemas-microsoft-com:office:word" xmlns:w="http://schemas.openxmlformats.org/wordprocessingml/2006/main" xmlns:w14="http://schemas.microsoft.com/office/word/2010/wordml" xmlns:w15="http://schemas.microsoft.com/office/word/2012/wordml" xmlns:w16cid="http://schemas.microsoft.com/office/word/2016/wordml/cid" xmlns:w16se="http://schemas.microsoft.com/office/word/2015/wordml/symex" xmlns:wpg="http://schemas.microsoft.com/office/word/2010/wordprocessingGroup" xmlns:wpi="http://schemas.microsoft.com/office/word/2010/wordprocessingInk" xmlns:wne="http://schemas.microsoft.com/office/word/2006/wordml" xmlns:wps="http://schemas.microsoft.com/office/word/2010/wordprocessingShape" mc:Ignorable="w14 w15 w16se w16cid wp14">
+<w:numbering xmlns:wpc="http://schemas.microsoft.com/office/word/2010/wordprocessingCanvas" xmlns:cx="http://schemas.microsoft.com/office/drawing/2014/chartex" xmlns:cx1="http://schemas.microsoft.com/office/drawing/2015/9/8/chartex" xmlns:cx2="http://schemas.microsoft.com/office/drawing/2015/10/21/chartex" xmlns:cx3="http://schemas.microsoft.com/office/drawing/2016/5/9/chartex" xmlns:cx4="http://schemas.microsoft.com/office/drawing/2016/5/10/chartex" xmlns:cx5="http://schemas.microsoft.com/office/drawing/2016/5/11/chartex" xmlns:cx6="http://schemas.microsoft.com/office/drawing/2016/5/12/chartex" xmlns:cx7="http://schemas.microsoft.com/office/drawing/2016/5/13/chartex" xmlns:cx8="http://schemas.microsoft.com/office/drawing/2016/5/14/chartex" xmlns:mc="http://schemas.openxmlformats.org/markup-compatibility/2006" xmlns:aink="http://schemas.microsoft.com/office/drawing/2016/ink" xmlns:am3d="http://schemas.microsoft.com/office/drawing/2017/model3d" xmlns:o="urn:schemas-microsoft-com:office:office" xmlns:r="http://schemas.openxmlformats.org/officeDocument/2006/relationships" xmlns:m="http://schemas.openxmlformats.org/officeDocument/2006/math" xmlns:v="urn:schemas-microsoft-com:vml" xmlns:wp14="http://schemas.microsoft.com/office/word/2010/wordprocessingDrawing" xmlns:wp="http://schemas.openxmlformats.org/drawingml/2006/wordprocessingDrawing" xmlns:w10="urn:schemas-microsoft-com:office:word" xmlns:w="http://schemas.openxmlformats.org/wordprocessingml/2006/main" xmlns:w14="http://schemas.microsoft.com/office/word/2010/wordml" xmlns:w15="http://schemas.microsoft.com/office/word/2012/wordml" xmlns:w16cex="http://schemas.microsoft.com/office/word/2018/wordml/cex" xmlns:w16cid="http://schemas.microsoft.com/office/word/2016/wordml/cid" xmlns:w16="http://schemas.microsoft.com/office/word/2018/wordml" xmlns:w16sdtdh="http://schemas.microsoft.com/office/word/2020/wordml/sdtdatahash" xmlns:w16se="http://schemas.microsoft.com/office/word/2015/wordml/symex" xmlns:wpg="http://schemas.microsoft.com/office/word/2010/wordprocessingGroup" xmlns:wpi="http://schemas.microsoft.com/office/word/2010/wordprocessingInk" xmlns:wne="http://schemas.microsoft.com/office/word/2006/wordml" xmlns:wps="http://schemas.microsoft.com/office/word/2010/wordprocessingShape" mc:Ignorable="w14 w15 w16se w16cid w16 w16cex w16sdtdh wp14">
   <w:abstractNum w:abstractNumId="0" w15:restartNumberingAfterBreak="0">
     <w:nsid w:val="2C4D412B"/>
     <w:multiLevelType w:val="hybridMultilevel"/>
@@ -1647,7 +1733,7 @@
 </file>
 
 <file path=word/styles.xml><?xml version="1.0" encoding="utf-8"?>
-<w:styles xmlns:mc="http://schemas.openxmlformats.org/markup-compatibility/2006" xmlns:r="http://schemas.openxmlformats.org/officeDocument/2006/relationships" xmlns:w="http://schemas.openxmlformats.org/wordprocessingml/2006/main" xmlns:w14="http://schemas.microsoft.com/office/word/2010/wordml" xmlns:w15="http://schemas.microsoft.com/office/word/2012/wordml" xmlns:w16cid="http://schemas.microsoft.com/office/word/2016/wordml/cid" xmlns:w16se="http://schemas.microsoft.com/office/word/2015/wordml/symex" mc:Ignorable="w14 w15 w16se w16cid">
+<w:styles xmlns:mc="http://schemas.openxmlformats.org/markup-compatibility/2006" xmlns:r="http://schemas.openxmlformats.org/officeDocument/2006/relationships" xmlns:w="http://schemas.openxmlformats.org/wordprocessingml/2006/main" xmlns:w14="http://schemas.microsoft.com/office/word/2010/wordml" xmlns:w15="http://schemas.microsoft.com/office/word/2012/wordml" xmlns:w16cex="http://schemas.microsoft.com/office/word/2018/wordml/cex" xmlns:w16cid="http://schemas.microsoft.com/office/word/2016/wordml/cid" xmlns:w16="http://schemas.microsoft.com/office/word/2018/wordml" xmlns:w16sdtdh="http://schemas.microsoft.com/office/word/2020/wordml/sdtdatahash" xmlns:w16se="http://schemas.microsoft.com/office/word/2015/wordml/symex" mc:Ignorable="w14 w15 w16se w16cid w16 w16cex w16sdtdh">
   <w:docDefaults>
     <w:rPrDefault>
       <w:rPr>
@@ -1663,7 +1749,7 @@
       </w:pPr>
     </w:pPrDefault>
   </w:docDefaults>
-  <w:latentStyles w:defLockedState="0" w:defUIPriority="99" w:defSemiHidden="0" w:defUnhideWhenUsed="0" w:defQFormat="0" w:count="375">
+  <w:latentStyles w:defLockedState="0" w:defUIPriority="99" w:defSemiHidden="0" w:defUnhideWhenUsed="0" w:defQFormat="0" w:count="376">
     <w:lsdException w:name="Normal" w:uiPriority="0" w:qFormat="1"/>
     <w:lsdException w:name="heading 1" w:uiPriority="9" w:qFormat="1"/>
     <w:lsdException w:name="heading 2" w:semiHidden="1" w:uiPriority="9" w:unhideWhenUsed="1" w:qFormat="1"/>
@@ -1769,7 +1855,6 @@
     <w:lsdException w:name="HTML Sample" w:semiHidden="1" w:unhideWhenUsed="1"/>
     <w:lsdException w:name="HTML Typewriter" w:semiHidden="1" w:unhideWhenUsed="1"/>
     <w:lsdException w:name="HTML Variable" w:semiHidden="1" w:unhideWhenUsed="1"/>
-    <w:lsdException w:name="Normal Table" w:semiHidden="1" w:unhideWhenUsed="1"/>
     <w:lsdException w:name="annotation subject" w:semiHidden="1" w:unhideWhenUsed="1"/>
     <w:lsdException w:name="No List" w:semiHidden="1" w:unhideWhenUsed="1"/>
     <w:lsdException w:name="Outline List 1" w:semiHidden="1" w:unhideWhenUsed="1"/>
@@ -1816,10 +1901,8 @@
     <w:lsdException w:name="Table Subtle 2" w:semiHidden="1" w:unhideWhenUsed="1"/>
     <w:lsdException w:name="Table Web 1" w:semiHidden="1" w:unhideWhenUsed="1"/>
     <w:lsdException w:name="Table Web 2" w:semiHidden="1" w:unhideWhenUsed="1"/>
-    <w:lsdException w:name="Table Web 3" w:semiHidden="1" w:unhideWhenUsed="1"/>
     <w:lsdException w:name="Balloon Text" w:semiHidden="1" w:unhideWhenUsed="1"/>
     <w:lsdException w:name="Table Grid" w:uiPriority="39"/>
-    <w:lsdException w:name="Table Theme" w:semiHidden="1" w:unhideWhenUsed="1"/>
     <w:lsdException w:name="Placeholder Text" w:semiHidden="1"/>
     <w:lsdException w:name="No Spacing" w:uiPriority="1" w:qFormat="1"/>
     <w:lsdException w:name="Light Shading" w:uiPriority="60"/>
@@ -2039,6 +2122,7 @@
     <w:lsdException w:name="Smart Hyperlink" w:semiHidden="1" w:unhideWhenUsed="1"/>
     <w:lsdException w:name="Hashtag" w:semiHidden="1" w:unhideWhenUsed="1"/>
     <w:lsdException w:name="Unresolved Mention" w:semiHidden="1" w:unhideWhenUsed="1"/>
+    <w:lsdException w:name="Smart Link" w:semiHidden="1" w:unhideWhenUsed="1"/>
   </w:latentStyles>
   <w:style w:type="paragraph" w:default="1" w:styleId="Normal">
     <w:name w:val="Normal"/>

</xml_diff>